<commit_message>
Điều chỉnh hiển thị và lưu ảnh vào thư mục Images, cập nhật lại file .sql
</commit_message>
<xml_diff>
--- a/thesis/doc/ĐỒ-ÁN-MÔN-HỌC-CHUYÊN-ĐỀ-ASP.NET.docx
+++ b/thesis/doc/ĐỒ-ÁN-MÔN-HỌC-CHUYÊN-ĐỀ-ASP.NET.docx
@@ -2216,39 +2216,30 @@
     </w:p>
     <w:p>
       <w:pPr>
-        <w:spacing w:line="360" w:lineRule="auto"/>
-        <w:rPr>
-          <w:iCs/>
-          <w:sz w:val="26"/>
-          <w:szCs w:val="26"/>
-        </w:rPr>
-      </w:pPr>
-      <w:r>
-        <w:rPr>
-          <w:iCs/>
-          <w:sz w:val="26"/>
-          <w:szCs w:val="26"/>
+        <w:spacing w:before="1"/>
+        <w:ind w:left="2198"/>
+        <w:rPr>
+          <w:b/>
+        </w:rPr>
+      </w:pPr>
+      <w:r>
+        <w:rPr>
+          <w:noProof/>
         </w:rPr>
         <w:lastRenderedPageBreak/>
-        <w:br w:type="page"/>
-      </w:r>
-      <w:r>
-        <w:rPr>
-          <w:noProof/>
-        </w:rPr>
         <mc:AlternateContent>
           <mc:Choice Requires="wps">
             <w:drawing>
-              <wp:anchor distT="0" distB="0" distL="0" distR="0" simplePos="0" relativeHeight="251659776" behindDoc="1" locked="0" layoutInCell="1" allowOverlap="1" wp14:anchorId="2D5AF3CC" wp14:editId="64C318C4">
+              <wp:anchor distT="0" distB="0" distL="0" distR="0" simplePos="0" relativeHeight="251660800" behindDoc="1" locked="0" layoutInCell="1" allowOverlap="1" wp14:anchorId="12D4A544" wp14:editId="2717C386">
                 <wp:simplePos x="0" y="0"/>
-                <wp:positionH relativeFrom="page">
-                  <wp:posOffset>1296035</wp:posOffset>
+                <wp:positionH relativeFrom="margin">
+                  <wp:posOffset>375285</wp:posOffset>
                 </wp:positionH>
                 <wp:positionV relativeFrom="page">
-                  <wp:posOffset>871855</wp:posOffset>
+                  <wp:posOffset>777875</wp:posOffset>
                 </wp:positionV>
                 <wp:extent cx="5372100" cy="9144000"/>
-                <wp:effectExtent l="10160" t="5080" r="8890" b="13970"/>
+                <wp:effectExtent l="0" t="0" r="19050" b="19050"/>
                 <wp:wrapNone/>
                 <wp:docPr id="14" name="Graphic 11"/>
                 <wp:cNvGraphicFramePr>
@@ -2355,9 +2346,9 @@
           </mc:Choice>
           <mc:Fallback>
             <w:pict>
-              <v:shape w14:anchorId="01471E25" id="Graphic 11" o:spid="_x0000_s1026" style="position:absolute;margin-left:102.05pt;margin-top:68.65pt;width:423pt;height:10in;z-index:-251656704;visibility:visible;mso-wrap-style:square;mso-width-percent:0;mso-height-percent:0;mso-wrap-distance-left:0;mso-wrap-distance-top:0;mso-wrap-distance-right:0;mso-wrap-distance-bottom:0;mso-position-horizontal:absolute;mso-position-horizontal-relative:page;mso-position-vertical:absolute;mso-position-vertical-relative:page;mso-width-percent:0;mso-height-percent:0;mso-width-relative:page;mso-height-relative:page;v-text-anchor:top" coordsize="5372100,9144000" o:gfxdata="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" path="m,9144000r5372100,l5372100,,,,,9144000xe" filled="f">
+              <v:shape w14:anchorId="05CB0860" id="Graphic 11" o:spid="_x0000_s1026" style="position:absolute;margin-left:29.55pt;margin-top:61.25pt;width:423pt;height:10in;z-index:-251655680;visibility:visible;mso-wrap-style:square;mso-width-percent:0;mso-height-percent:0;mso-wrap-distance-left:0;mso-wrap-distance-top:0;mso-wrap-distance-right:0;mso-wrap-distance-bottom:0;mso-position-horizontal:absolute;mso-position-horizontal-relative:margin;mso-position-vertical:absolute;mso-position-vertical-relative:page;mso-width-percent:0;mso-height-percent:0;mso-width-relative:page;mso-height-relative:page;v-text-anchor:top" coordsize="5372100,9144000" o:gfxdata="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" path="m,9144000r5372100,l5372100,,,,,9144000xe" filled="f">
                 <v:path arrowok="t" o:connecttype="custom" o:connectlocs="0,9144000;5372100,9144000;5372100,0;0,0;0,9144000" o:connectangles="0,0,0,0,0"/>
-                <w10:wrap anchorx="page" anchory="page"/>
+                <w10:wrap anchorx="margin" anchory="page"/>
               </v:shape>
             </w:pict>
           </mc:Fallback>
@@ -2367,15 +2358,6 @@
     <w:p>
       <w:pPr>
         <w:spacing w:before="1"/>
-        <w:ind w:left="2198"/>
-        <w:rPr>
-          <w:b/>
-        </w:rPr>
-      </w:pPr>
-    </w:p>
-    <w:p>
-      <w:pPr>
-        <w:spacing w:before="1"/>
         <w:ind w:left="2410"/>
         <w:rPr>
           <w:b/>
@@ -3173,19 +3155,37 @@
     </w:p>
     <w:p>
       <w:pPr>
-        <w:jc w:val="center"/>
-        <w:rPr>
-          <w:b/>
-          <w:spacing w:val="-5"/>
-          <w:sz w:val="26"/>
-        </w:rPr>
-      </w:pPr>
-      <w:r>
         <w:rPr>
           <w:b/>
           <w:sz w:val="28"/>
           <w:szCs w:val="28"/>
         </w:rPr>
+      </w:pPr>
+      <w:r>
+        <w:rPr>
+          <w:b/>
+          <w:sz w:val="28"/>
+          <w:szCs w:val="28"/>
+        </w:rPr>
+        <w:br w:type="page"/>
+      </w:r>
+    </w:p>
+    <w:p>
+      <w:pPr>
+        <w:jc w:val="center"/>
+        <w:rPr>
+          <w:b/>
+          <w:spacing w:val="-5"/>
+          <w:sz w:val="26"/>
+        </w:rPr>
+      </w:pPr>
+      <w:r>
+        <w:rPr>
+          <w:b/>
+          <w:sz w:val="28"/>
+          <w:szCs w:val="28"/>
+        </w:rPr>
+        <w:lastRenderedPageBreak/>
         <w:t>LỜI</w:t>
       </w:r>
       <w:r>
@@ -14833,7 +14833,10 @@
     <w:rsidRoot w:val="009C1A1B"/>
     <w:rsid w:val="001F47B3"/>
     <w:rsid w:val="006F1FC9"/>
+    <w:rsid w:val="009B5DBF"/>
     <w:rsid w:val="009C1A1B"/>
+    <w:rsid w:val="00BC76F3"/>
+    <w:rsid w:val="00BF6B1B"/>
   </w:rsids>
   <m:mathPr>
     <m:mathFont m:val="Cambria Math"/>

</xml_diff>

<commit_message>
Thêm kiểm tra dữ liệu ở trang thanh toán, cập nhật đường dẫn hiển thị và  lưu avatar. Cập nhật doc
</commit_message>
<xml_diff>
--- a/thesis/doc/ĐỒ-ÁN-MÔN-HỌC-CHUYÊN-ĐỀ-ASP.NET.docx
+++ b/thesis/doc/ĐỒ-ÁN-MÔN-HỌC-CHUYÊN-ĐỀ-ASP.NET.docx
@@ -13930,14 +13930,14 @@
           <w:sz w:val="26"/>
           <w:szCs w:val="26"/>
         </w:rPr>
-        <w:t>UC Đăng nhập quản trị:</w:t>
-      </w:r>
-      <w:r>
-        <w:rPr>
-          <w:sz w:val="26"/>
-          <w:szCs w:val="26"/>
-        </w:rPr>
-        <w:t> Bắt buộc thực hiện để xác thực quyền Admin (Role = 1). Mọi Use case khác của Admin đều có quan hệ &lt;&lt;include&gt;&gt; với Use case này.</w:t>
+        <w:t xml:space="preserve">UC Đăng nhập (Dùng chung cho cả User và Admin): </w:t>
+      </w:r>
+      <w:r>
+        <w:rPr>
+          <w:sz w:val="26"/>
+          <w:szCs w:val="26"/>
+        </w:rPr>
+        <w:t>Tác nhân bắt buộc phải nhập tên tài khoản và mật khẩu để xác thực danh tính. Hệ thống sẽ tự động phân giải quyền dựa trên dữ liệu (Cột Role): nếu là Khách hàng (Role = 0) sẽ được quyền đặt hàng và quản lý hồ sơ; nếu là Quản trị viên (Role = 1) sẽ được điều hướng thẳng vào Bảng điều khiển để thực hiện các nghiệp vụ quản lý (Thêm/Sửa/Xóa). Mọi Use case bên trong của Admin đều ngầm định yêu cầu phải đi qua bước Đăng nhập này.</w:t>
       </w:r>
     </w:p>
     <w:p>
@@ -13990,6 +13990,7 @@
           <w:sz w:val="26"/>
           <w:szCs w:val="26"/>
         </w:rPr>
+        <w:lastRenderedPageBreak/>
         <w:t>UC Quản lý Danh mục &amp; Thương hiệu:</w:t>
       </w:r>
       <w:r>
@@ -14094,7 +14095,6 @@
           <w:sz w:val="26"/>
           <w:szCs w:val="26"/>
         </w:rPr>
-        <w:lastRenderedPageBreak/>
         <w:t>(Cấp con)</w:t>
       </w:r>
       <w:r>
@@ -26926,6 +26926,7 @@
   <w:style w:type="character" w:default="1" w:styleId="DefaultParagraphFont">
     <w:name w:val="Default Paragraph Font"/>
     <w:uiPriority w:val="1"/>
+    <w:semiHidden/>
     <w:unhideWhenUsed/>
   </w:style>
   <w:style w:type="table" w:default="1" w:styleId="TableNormal">
@@ -27487,6 +27488,9 @@
     <w:rsid w:val="009C1A1B"/>
     <w:rsid w:val="00BC76F3"/>
     <w:rsid w:val="00BF6B1B"/>
+    <w:rsid w:val="00C608A5"/>
+    <w:rsid w:val="00E17C8F"/>
+    <w:rsid w:val="00F81017"/>
   </w:rsids>
   <m:mathPr>
     <m:mathFont m:val="Cambria Math"/>

</xml_diff>